<commit_message>
Updated I lesson generation workflow. Related content gen skills added to repo.
</commit_message>
<xml_diff>
--- a/Grade_9/Semester_1/01_Safety/005_I - Scenario rotation task/Teacher_Plan.docx
+++ b/Grade_9/Semester_1/01_Safety/005_I - Scenario rotation task/Teacher_Plan.docx
@@ -30,10 +30,10 @@
       <w:tblPr>
         <w:tblW w:type="auto" w:w="100"/>
         <w:tblBorders>
-          <w:top w:val="none" w:color="FFFFFF" w:sz="0"/>
-          <w:left w:val="none" w:color="FFFFFF" w:sz="0"/>
-          <w:bottom w:val="none" w:color="FFFFFF" w:sz="0"/>
-          <w:right w:val="none" w:color="FFFFFF" w:sz="0"/>
+          <w:top w:val="none" w:sz="0"/>
+          <w:left w:val="none" w:sz="0"/>
+          <w:bottom w:val="none" w:sz="0"/>
+          <w:right w:val="none" w:sz="0"/>
           <w:insideH w:val="single" w:color="auto" w:sz="4"/>
           <w:insideV w:val="single" w:color="auto" w:sz="4"/>
         </w:tblBorders>
@@ -48,10 +48,10 @@
           <w:tcPr>
             <w:tcW w:type="dxa" w:w="2400"/>
             <w:tcBorders>
-              <w:top w:val="none" w:color="FFFFFF" w:sz="0"/>
-              <w:left w:val="none" w:color="FFFFFF" w:sz="0"/>
+              <w:top w:val="none" w:sz="0"/>
+              <w:left w:val="none" w:sz="0"/>
               <w:bottom w:val="single" w:color="EEEEEE" w:sz="4"/>
-              <w:right w:val="none" w:color="FFFFFF" w:sz="0"/>
+              <w:right w:val="none" w:sz="0"/>
             </w:tcBorders>
             <w:shd w:fill="F8F9FA" w:val="clear"/>
             <w:tcMar>
@@ -79,10 +79,10 @@
           <w:tcPr>
             <w:tcW w:type="dxa" w:w="7200"/>
             <w:tcBorders>
-              <w:top w:val="none" w:color="FFFFFF" w:sz="0"/>
-              <w:left w:val="none" w:color="FFFFFF" w:sz="0"/>
+              <w:top w:val="none" w:sz="0"/>
+              <w:left w:val="none" w:sz="0"/>
               <w:bottom w:val="single" w:color="EEEEEE" w:sz="4"/>
-              <w:right w:val="none" w:color="FFFFFF" w:sz="0"/>
+              <w:right w:val="none" w:sz="0"/>
             </w:tcBorders>
             <w:shd w:fill="F8F9FA" w:val="clear"/>
             <w:tcMar>
@@ -100,7 +100,7 @@
                 <w:sz w:val="22"/>
                 <w:szCs w:val="22"/>
               </w:rPr>
-              <w:t xml:space="preserve">I — Integravimo pamoka (5 iš 7 apie saugą)</w:t>
+              <w:t xml:space="preserve">I — Integravimo pamoka (5 iš 7 apie saugumą)</w:t>
             </w:r>
           </w:p>
         </w:tc>
@@ -110,10 +110,10 @@
           <w:tcPr>
             <w:tcW w:type="dxa" w:w="2400"/>
             <w:tcBorders>
-              <w:top w:val="none" w:color="FFFFFF" w:sz="0"/>
-              <w:left w:val="none" w:color="FFFFFF" w:sz="0"/>
+              <w:top w:val="none" w:sz="0"/>
+              <w:left w:val="none" w:sz="0"/>
               <w:bottom w:val="single" w:color="EEEEEE" w:sz="4"/>
-              <w:right w:val="none" w:color="FFFFFF" w:sz="0"/>
+              <w:right w:val="none" w:sz="0"/>
             </w:tcBorders>
             <w:shd w:fill="F8F9FA" w:val="clear"/>
             <w:tcMar>
@@ -141,10 +141,10 @@
           <w:tcPr>
             <w:tcW w:type="dxa" w:w="7200"/>
             <w:tcBorders>
-              <w:top w:val="none" w:color="FFFFFF" w:sz="0"/>
-              <w:left w:val="none" w:color="FFFFFF" w:sz="0"/>
+              <w:top w:val="none" w:sz="0"/>
+              <w:left w:val="none" w:sz="0"/>
               <w:bottom w:val="single" w:color="EEEEEE" w:sz="4"/>
-              <w:right w:val="none" w:color="FFFFFF" w:sz="0"/>
+              <w:right w:val="none" w:sz="0"/>
             </w:tcBorders>
             <w:shd w:fill="F8F9FA" w:val="clear"/>
             <w:tcMar>
@@ -172,10 +172,10 @@
           <w:tcPr>
             <w:tcW w:type="dxa" w:w="2400"/>
             <w:tcBorders>
-              <w:top w:val="none" w:color="FFFFFF" w:sz="0"/>
-              <w:left w:val="none" w:color="FFFFFF" w:sz="0"/>
+              <w:top w:val="none" w:sz="0"/>
+              <w:left w:val="none" w:sz="0"/>
               <w:bottom w:val="single" w:color="EEEEEE" w:sz="4"/>
-              <w:right w:val="none" w:color="FFFFFF" w:sz="0"/>
+              <w:right w:val="none" w:sz="0"/>
             </w:tcBorders>
             <w:shd w:fill="F8F9FA" w:val="clear"/>
             <w:tcMar>
@@ -203,10 +203,10 @@
           <w:tcPr>
             <w:tcW w:type="dxa" w:w="7200"/>
             <w:tcBorders>
-              <w:top w:val="none" w:color="FFFFFF" w:sz="0"/>
-              <w:left w:val="none" w:color="FFFFFF" w:sz="0"/>
+              <w:top w:val="none" w:sz="0"/>
+              <w:left w:val="none" w:sz="0"/>
               <w:bottom w:val="single" w:color="EEEEEE" w:sz="4"/>
-              <w:right w:val="none" w:color="FFFFFF" w:sz="0"/>
+              <w:right w:val="none" w:sz="0"/>
             </w:tcBorders>
             <w:shd w:fill="F8F9FA" w:val="clear"/>
             <w:tcMar>
@@ -234,10 +234,10 @@
           <w:tcPr>
             <w:tcW w:type="dxa" w:w="2400"/>
             <w:tcBorders>
-              <w:top w:val="none" w:color="FFFFFF" w:sz="0"/>
-              <w:left w:val="none" w:color="FFFFFF" w:sz="0"/>
+              <w:top w:val="none" w:sz="0"/>
+              <w:left w:val="none" w:sz="0"/>
               <w:bottom w:val="single" w:color="EEEEEE" w:sz="4"/>
-              <w:right w:val="none" w:color="FFFFFF" w:sz="0"/>
+              <w:right w:val="none" w:sz="0"/>
             </w:tcBorders>
             <w:shd w:fill="F8F9FA" w:val="clear"/>
             <w:tcMar>
@@ -265,10 +265,10 @@
           <w:tcPr>
             <w:tcW w:type="dxa" w:w="7200"/>
             <w:tcBorders>
-              <w:top w:val="none" w:color="FFFFFF" w:sz="0"/>
-              <w:left w:val="none" w:color="FFFFFF" w:sz="0"/>
+              <w:top w:val="none" w:sz="0"/>
+              <w:left w:val="none" w:sz="0"/>
               <w:bottom w:val="single" w:color="EEEEEE" w:sz="4"/>
-              <w:right w:val="none" w:color="FFFFFF" w:sz="0"/>
+              <w:right w:val="none" w:sz="0"/>
             </w:tcBorders>
             <w:shd w:fill="F8F9FA" w:val="clear"/>
             <w:tcMar>
@@ -296,10 +296,10 @@
           <w:tcPr>
             <w:tcW w:type="dxa" w:w="2400"/>
             <w:tcBorders>
-              <w:top w:val="none" w:color="FFFFFF" w:sz="0"/>
-              <w:left w:val="none" w:color="FFFFFF" w:sz="0"/>
+              <w:top w:val="none" w:sz="0"/>
+              <w:left w:val="none" w:sz="0"/>
               <w:bottom w:val="single" w:color="EEEEEE" w:sz="4"/>
-              <w:right w:val="none" w:color="FFFFFF" w:sz="0"/>
+              <w:right w:val="none" w:sz="0"/>
             </w:tcBorders>
             <w:shd w:fill="F8F9FA" w:val="clear"/>
             <w:tcMar>
@@ -327,10 +327,10 @@
           <w:tcPr>
             <w:tcW w:type="dxa" w:w="7200"/>
             <w:tcBorders>
-              <w:top w:val="none" w:color="FFFFFF" w:sz="0"/>
-              <w:left w:val="none" w:color="FFFFFF" w:sz="0"/>
+              <w:top w:val="none" w:sz="0"/>
+              <w:left w:val="none" w:sz="0"/>
               <w:bottom w:val="single" w:color="EEEEEE" w:sz="4"/>
-              <w:right w:val="none" w:color="FFFFFF" w:sz="0"/>
+              <w:right w:val="none" w:sz="0"/>
             </w:tcBorders>
             <w:shd w:fill="F8F9FA" w:val="clear"/>
             <w:tcMar>
@@ -348,7 +348,7 @@
                 <w:sz w:val="22"/>
                 <w:szCs w:val="22"/>
               </w:rPr>
-              <w:t xml:space="preserve">Ši pamoka integruoja visas 4 ankstesnių pamokų temas (ergonomika, privatumas, internetinės rizikos, aplinkos poveikis) per praktinių scenarijų analizę. Naujos teorijos nėra — mokiniai taiko jau išmoktą medžiagą.</w:t>
+              <w:t xml:space="preserve">Mokiniai taiko visų keturių saugos temų žinias (ergonomika, privatumas, internetinės rizikos, aplinkos poveikis) analizuodami naujus scenarijus. Kiekvienoje situacijoje reikia identifikuoti problemą, prisiminti taisyklę ir pasiūlyti veiksmą. Naujos teorijos nepristatoma.</w:t>
             </w:r>
           </w:p>
         </w:tc>
@@ -458,12 +458,12 @@
                 <w:sz w:val="22"/>
                 <w:szCs w:val="22"/>
               </w:rPr>
-              <w:t xml:space="preserve">Argumentuotai pagrįsti savo sprendimą žodžiu: identifikuoti problemą, nurodyti taisyklę, pasiūlyti veiksmą.</w:t>
+              <w:t xml:space="preserve">Raštu identifikuoti problemą, nurodyti taisyklę ir pasiūlyti konkretų veiksmą kiekvienam scenarijui.</w:t>
             </w:r>
           </w:p>
           <w:p>
             <w:pPr>
-              <w:spacing w:after="0"/>
+              <w:spacing w:after="60"/>
             </w:pPr>
             <w:r>
               <w:rPr>
@@ -498,10 +498,10 @@
       <w:tblPr>
         <w:tblW w:type="auto" w:w="100"/>
         <w:tblBorders>
-          <w:top w:val="none" w:color="FFFFFF" w:sz="0"/>
-          <w:left w:val="none" w:color="FFFFFF" w:sz="0"/>
-          <w:bottom w:val="none" w:color="FFFFFF" w:sz="0"/>
-          <w:right w:val="none" w:color="FFFFFF" w:sz="0"/>
+          <w:top w:val="none" w:sz="0"/>
+          <w:left w:val="none" w:sz="0"/>
+          <w:bottom w:val="none" w:sz="0"/>
+          <w:right w:val="none" w:sz="0"/>
           <w:insideH w:val="single" w:color="auto" w:sz="4"/>
           <w:insideV w:val="single" w:color="auto" w:sz="4"/>
         </w:tblBorders>
@@ -518,6 +518,12 @@
         <w:tc>
           <w:tcPr>
             <w:tcW w:type="dxa" w:w="200"/>
+            <w:tcBorders>
+              <w:top w:val="none" w:sz="0"/>
+              <w:left w:val="none" w:sz="0"/>
+              <w:bottom w:val="none" w:sz="0"/>
+              <w:right w:val="none" w:sz="0"/>
+            </w:tcBorders>
             <w:shd w:fill="F57C00" w:val="clear"/>
           </w:tcPr>
           <w:p/>
@@ -525,6 +531,12 @@
         <w:tc>
           <w:tcPr>
             <w:tcW w:type="dxa" w:w="9400"/>
+            <w:tcBorders>
+              <w:top w:val="none" w:sz="0"/>
+              <w:left w:val="none" w:sz="0"/>
+              <w:bottom w:val="none" w:sz="0"/>
+              <w:right w:val="none" w:sz="0"/>
+            </w:tcBorders>
             <w:shd w:fill="FFF3E0" w:val="clear"/>
           </w:tcPr>
           <w:p>
@@ -554,7 +566,6 @@
     </w:tbl>
     <w:p>
       <w:pPr>
-        <w:keepNext/>
         <w:spacing w:after="80"/>
       </w:pPr>
       <w:r>
@@ -575,105 +586,7 @@
           <w:sz w:val="22"/>
           <w:szCs w:val="22"/>
         </w:rPr>
-        <w:t xml:space="preserve">žodinis. Klausimai skaidrėje.</w:t>
-      </w:r>
-    </w:p>
-    <w:p>
-      <w:pPr>
-        <w:keepNext/>
-        <w:spacing w:after="80"/>
-      </w:pPr>
-      <w:r>
-        <w:rPr>
-          <w:rFonts w:ascii="Arial" w:cs="Arial" w:eastAsia="Arial" w:hAnsi="Arial"/>
-          <w:b/>
-          <w:bCs/>
-          <w:color w:val="212121"/>
-          <w:sz w:val="22"/>
-          <w:szCs w:val="22"/>
-        </w:rPr>
-        <w:t xml:space="preserve">Klausimai iš visų ankstesnių pamokų (kartojimas):</w:t>
-      </w:r>
-    </w:p>
-    <w:p>
-      <w:pPr>
-        <w:keepNext/>
-        <w:spacing w:after="60"/>
-        <w:ind w:left="360"/>
-      </w:pPr>
-      <w:r>
-        <w:rPr>
-          <w:rFonts w:ascii="Arial" w:cs="Arial" w:eastAsia="Arial" w:hAnsi="Arial"/>
-          <w:b/>
-          <w:bCs/>
-          <w:color w:val="F57C00"/>
-          <w:sz w:val="22"/>
-          <w:szCs w:val="22"/>
-        </w:rPr>
-        <w:t xml:space="preserve">1. </w:t>
-      </w:r>
-      <w:r>
-        <w:rPr>
-          <w:rFonts w:ascii="Arial" w:cs="Arial" w:eastAsia="Arial" w:hAnsi="Arial"/>
-          <w:color w:val="212121"/>
-          <w:sz w:val="22"/>
-          <w:szCs w:val="22"/>
-        </w:rPr>
-        <w:t xml:space="preserve">Ką reiškia 20-20-20 taisyklė?</w:t>
-      </w:r>
-    </w:p>
-    <w:p>
-      <w:pPr>
-        <w:keepNext/>
-        <w:spacing w:after="60"/>
-        <w:ind w:left="360"/>
-      </w:pPr>
-      <w:r>
-        <w:rPr>
-          <w:rFonts w:ascii="Arial" w:cs="Arial" w:eastAsia="Arial" w:hAnsi="Arial"/>
-          <w:b/>
-          <w:bCs/>
-          <w:color w:val="F57C00"/>
-          <w:sz w:val="22"/>
-          <w:szCs w:val="22"/>
-        </w:rPr>
-        <w:t xml:space="preserve">2. </w:t>
-      </w:r>
-      <w:r>
-        <w:rPr>
-          <w:rFonts w:ascii="Arial" w:cs="Arial" w:eastAsia="Arial" w:hAnsi="Arial"/>
-          <w:color w:val="212121"/>
-          <w:sz w:val="22"/>
-          <w:szCs w:val="22"/>
-        </w:rPr>
-        <w:t xml:space="preserve">Kokie 3 žingsniai saugaus reagavimo algoritme?</w:t>
-      </w:r>
-    </w:p>
-    <w:p>
-      <w:pPr>
-        <w:keepNext/>
-        <w:spacing w:after="60"/>
-        <w:ind w:left="360"/>
-      </w:pPr>
-      <w:r>
-        <w:rPr>
-          <w:rFonts w:ascii="Arial" w:cs="Arial" w:eastAsia="Arial" w:hAnsi="Arial"/>
-          <w:b/>
-          <w:bCs/>
-          <w:color w:val="F57C00"/>
-          <w:sz w:val="22"/>
-          <w:szCs w:val="22"/>
-        </w:rPr>
-        <w:t xml:space="preserve">3. </w:t>
-      </w:r>
-      <w:r>
-        <w:rPr>
-          <w:rFonts w:ascii="Arial" w:cs="Arial" w:eastAsia="Arial" w:hAnsi="Arial"/>
-          <w:color w:val="212121"/>
-          <w:sz w:val="22"/>
-          <w:szCs w:val="22"/>
-        </w:rPr>
-        <w:t xml:space="preserve">Įvardinkite 2 būdus sumažinti savo skaitmeninį pėdsaką.</w:t>
+        <w:t xml:space="preserve">žodinis.</w:t>
       </w:r>
     </w:p>
     <w:p>
@@ -690,7 +603,111 @@
           <w:sz w:val="20"/>
           <w:szCs w:val="20"/>
         </w:rPr>
-        <w:t xml:space="preserve">Ryšys: „Šiandien viską, ką išmokome per 4 pamokas, pritaikysime naujose situacijose. Veiksite savarankiškai.“</w:t>
+        <w:t xml:space="preserve">(Klausimai apima visas 4 saugos sritis — po vieną iš kiekvienos L pamokos.)</w:t>
+      </w:r>
+    </w:p>
+    <w:p>
+      <w:pPr>
+        <w:spacing w:after="60"/>
+        <w:ind w:left="360"/>
+      </w:pPr>
+      <w:r>
+        <w:rPr>
+          <w:rFonts w:ascii="Arial" w:cs="Arial" w:eastAsia="Arial" w:hAnsi="Arial"/>
+          <w:b/>
+          <w:bCs/>
+          <w:color w:val="F57C00"/>
+          <w:sz w:val="22"/>
+          <w:szCs w:val="22"/>
+        </w:rPr>
+        <w:t xml:space="preserve">1. </w:t>
+      </w:r>
+      <w:r>
+        <w:rPr>
+          <w:rFonts w:ascii="Arial" w:cs="Arial" w:eastAsia="Arial" w:hAnsi="Arial"/>
+          <w:color w:val="212121"/>
+          <w:sz w:val="22"/>
+          <w:szCs w:val="22"/>
+        </w:rPr>
+        <w:t xml:space="preserve">Kokie 3 ergonomikos principai padeda išvengti nugaros skausmo dirbant kompiuteriu?</w:t>
+      </w:r>
+    </w:p>
+    <w:p>
+      <w:pPr>
+        <w:spacing w:after="60"/>
+        <w:ind w:left="360"/>
+      </w:pPr>
+      <w:r>
+        <w:rPr>
+          <w:rFonts w:ascii="Arial" w:cs="Arial" w:eastAsia="Arial" w:hAnsi="Arial"/>
+          <w:b/>
+          <w:bCs/>
+          <w:color w:val="F57C00"/>
+          <w:sz w:val="22"/>
+          <w:szCs w:val="22"/>
+        </w:rPr>
+        <w:t xml:space="preserve">2. </w:t>
+      </w:r>
+      <w:r>
+        <w:rPr>
+          <w:rFonts w:ascii="Arial" w:cs="Arial" w:eastAsia="Arial" w:hAnsi="Arial"/>
+          <w:color w:val="212121"/>
+          <w:sz w:val="22"/>
+          <w:szCs w:val="22"/>
+        </w:rPr>
+        <w:t xml:space="preserve">Kodėl dviejų veiksnių autentifikacija apsaugo paskyrą, net jei slaptažodis pavogtas?</w:t>
+      </w:r>
+    </w:p>
+    <w:p>
+      <w:pPr>
+        <w:spacing w:after="60"/>
+        <w:ind w:left="360"/>
+      </w:pPr>
+      <w:r>
+        <w:rPr>
+          <w:rFonts w:ascii="Arial" w:cs="Arial" w:eastAsia="Arial" w:hAnsi="Arial"/>
+          <w:b/>
+          <w:bCs/>
+          <w:color w:val="F57C00"/>
+          <w:sz w:val="22"/>
+          <w:szCs w:val="22"/>
+        </w:rPr>
+        <w:t xml:space="preserve">3. </w:t>
+      </w:r>
+      <w:r>
+        <w:rPr>
+          <w:rFonts w:ascii="Arial" w:cs="Arial" w:eastAsia="Arial" w:hAnsi="Arial"/>
+          <w:color w:val="212121"/>
+          <w:sz w:val="22"/>
+          <w:szCs w:val="22"/>
+        </w:rPr>
+        <w:t xml:space="preserve">Kokius 3 žingsnius reikia atlikti, kai gauni įtartiną el. laišką?</w:t>
+      </w:r>
+    </w:p>
+    <w:p>
+      <w:pPr>
+        <w:spacing w:after="60"/>
+        <w:ind w:left="360"/>
+      </w:pPr>
+      <w:r>
+        <w:rPr>
+          <w:rFonts w:ascii="Arial" w:cs="Arial" w:eastAsia="Arial" w:hAnsi="Arial"/>
+          <w:b/>
+          <w:bCs/>
+          <w:color w:val="F57C00"/>
+          <w:sz w:val="22"/>
+          <w:szCs w:val="22"/>
+        </w:rPr>
+        <w:t xml:space="preserve">4. </w:t>
+      </w:r>
+      <w:r>
+        <w:rPr>
+          <w:rFonts w:ascii="Arial" w:cs="Arial" w:eastAsia="Arial" w:hAnsi="Arial"/>
+          <w:color w:val="212121"/>
+          <w:sz w:val="22"/>
+          <w:szCs w:val="22"/>
+        </w:rPr>
+        <w:t xml:space="preserve">Kodėl srautinis video sunaudoja daugiau energijos nei tekstinė žinutė?</w:t>
       </w:r>
     </w:p>
     <w:p>
@@ -702,10 +719,10 @@
       <w:tblPr>
         <w:tblW w:type="auto" w:w="100"/>
         <w:tblBorders>
-          <w:top w:val="none" w:color="FFFFFF" w:sz="0"/>
-          <w:left w:val="none" w:color="FFFFFF" w:sz="0"/>
-          <w:bottom w:val="none" w:color="FFFFFF" w:sz="0"/>
-          <w:right w:val="none" w:color="FFFFFF" w:sz="0"/>
+          <w:top w:val="none" w:sz="0"/>
+          <w:left w:val="none" w:sz="0"/>
+          <w:bottom w:val="none" w:sz="0"/>
+          <w:right w:val="none" w:sz="0"/>
           <w:insideH w:val="single" w:color="auto" w:sz="4"/>
           <w:insideV w:val="single" w:color="auto" w:sz="4"/>
         </w:tblBorders>
@@ -722,6 +739,12 @@
         <w:tc>
           <w:tcPr>
             <w:tcW w:type="dxa" w:w="200"/>
+            <w:tcBorders>
+              <w:top w:val="none" w:sz="0"/>
+              <w:left w:val="none" w:sz="0"/>
+              <w:bottom w:val="none" w:sz="0"/>
+              <w:right w:val="none" w:sz="0"/>
+            </w:tcBorders>
             <w:shd w:fill="1565C0" w:val="clear"/>
           </w:tcPr>
           <w:p/>
@@ -729,6 +752,12 @@
         <w:tc>
           <w:tcPr>
             <w:tcW w:type="dxa" w:w="9400"/>
+            <w:tcBorders>
+              <w:top w:val="none" w:sz="0"/>
+              <w:left w:val="none" w:sz="0"/>
+              <w:bottom w:val="none" w:sz="0"/>
+              <w:right w:val="none" w:sz="0"/>
+            </w:tcBorders>
             <w:shd w:fill="E3F2FD" w:val="clear"/>
           </w:tcPr>
           <w:p>
@@ -741,7 +770,7 @@
                 <w:sz w:val="24"/>
                 <w:szCs w:val="24"/>
               </w:rPr>
-              <w:t xml:space="preserve">Trumpas priminimas ir užduoties pristatymas</w:t>
+              <w:t xml:space="preserve">Užduoties pristatymas</w:t>
             </w:r>
             <w:r>
               <w:rPr>
@@ -750,7 +779,7 @@
                 <w:sz w:val="20"/>
                 <w:szCs w:val="20"/>
               </w:rPr>
-              <w:t xml:space="preserve"> — ~4 min.</w:t>
+              <w:t xml:space="preserve"> — ~5 min.</w:t>
             </w:r>
           </w:p>
         </w:tc>
@@ -768,50 +797,631 @@
           <w:sz w:val="22"/>
           <w:szCs w:val="22"/>
         </w:rPr>
-        <w:t xml:space="preserve">Priminkite 4 temas: ergonomika, privatumas/paskyros, internetinės rizikos, aplinkos poveikis.</w:t>
-      </w:r>
-    </w:p>
-    <w:p>
-      <w:pPr>
-        <w:spacing w:after="80"/>
-      </w:pPr>
-      <w:r>
-        <w:rPr>
-          <w:rFonts w:ascii="Arial" w:cs="Arial" w:eastAsia="Arial" w:hAnsi="Arial"/>
-          <w:color w:val="212121"/>
-          <w:sz w:val="22"/>
-          <w:szCs w:val="22"/>
-        </w:rPr>
-        <w:t xml:space="preserve">Paaiškinkite užduoties formatą: skaidrėje bus rodomi scenarijai, mokiniai turi „diagnozuoti“ situaciją ir pasiūlyti veiksmą. Atsakymai žodžiu.</w:t>
-      </w:r>
-    </w:p>
-    <w:p>
-      <w:pPr>
-        <w:spacing w:after="80"/>
-      </w:pPr>
-      <w:r>
-        <w:rPr>
-          <w:rFonts w:ascii="Arial" w:cs="Arial" w:eastAsia="Arial" w:hAnsi="Arial"/>
-          <w:color w:val="212121"/>
-          <w:sz w:val="22"/>
-          <w:szCs w:val="22"/>
-        </w:rPr>
-        <w:t xml:space="preserve">Kiekvienas scenarijus turi struktūrą: 1) kokia problema? 2) kokia taisyklė tinka? 3) ką daryti?</w:t>
-      </w:r>
-    </w:p>
-    <w:p>
-      <w:pPr>
-        <w:spacing w:before="200"/>
+        <w:t xml:space="preserve">Skaidrėje parodykite vieną pavyzdinį scenarijų ir kartu su klase trumpai aptarkite sprendimo logiką (1–2 min.). Tai vienintelis bendras aptarimas — likę scenarijai sprendžiami individualiai.</w:t>
+      </w:r>
+    </w:p>
+    <w:p>
+      <w:pPr>
+        <w:keepNext/>
+        <w:spacing w:after="80"/>
+      </w:pPr>
+      <w:r>
+        <w:rPr>
+          <w:rFonts w:ascii="Arial" w:cs="Arial" w:eastAsia="Arial" w:hAnsi="Arial"/>
+          <w:color w:val="212121"/>
+          <w:sz w:val="22"/>
+          <w:szCs w:val="22"/>
+        </w:rPr>
+        <w:t xml:space="preserve">Paaiškinkite užduotį ir vertinimo kriterijus. Instrukcijos lieka skaidrėje visą pamoką:</w:t>
+      </w:r>
+    </w:p>
+    <w:p>
+      <w:pPr>
+        <w:spacing w:before="80"/>
+      </w:pPr>
+    </w:p>
+    <w:p>
+      <w:pPr>
+        <w:keepNext/>
+        <w:spacing w:after="80"/>
+      </w:pPr>
+      <w:r>
+        <w:rPr>
+          <w:rFonts w:ascii="Arial" w:cs="Arial" w:eastAsia="Arial" w:hAnsi="Arial"/>
+          <w:b/>
+          <w:bCs/>
+          <w:color w:val="212121"/>
+          <w:sz w:val="22"/>
+          <w:szCs w:val="22"/>
+        </w:rPr>
+        <w:t xml:space="preserve">Užduotis: gavote 6 scenarijus iš skirtingų saugos sričių. Kiekvienam scenarijui užpildykite lentelę Google Classroom dokumente:</w:t>
+      </w:r>
+    </w:p>
+    <w:p>
+      <w:pPr>
+        <w:spacing w:before="80"/>
       </w:pPr>
     </w:p>
     <w:tbl>
       <w:tblPr>
         <w:tblW w:type="auto" w:w="100"/>
         <w:tblBorders>
-          <w:top w:val="none" w:color="FFFFFF" w:sz="0"/>
-          <w:left w:val="none" w:color="FFFFFF" w:sz="0"/>
-          <w:bottom w:val="none" w:color="FFFFFF" w:sz="0"/>
-          <w:right w:val="none" w:color="FFFFFF" w:sz="0"/>
+          <w:top w:val="single" w:color="auto" w:sz="4"/>
+          <w:left w:val="single" w:color="auto" w:sz="4"/>
+          <w:bottom w:val="single" w:color="auto" w:sz="4"/>
+          <w:right w:val="single" w:color="auto" w:sz="4"/>
+          <w:insideH w:val="single" w:color="auto" w:sz="4"/>
+          <w:insideV w:val="single" w:color="auto" w:sz="4"/>
+        </w:tblBorders>
+        <w:tblLayout w:type="fixed"/>
+      </w:tblPr>
+      <w:tblGrid>
+        <w:gridCol w:w="600"/>
+        <w:gridCol w:w="4000"/>
+        <w:gridCol w:w="5000"/>
+      </w:tblGrid>
+      <w:tr>
+        <w:tc>
+          <w:tcPr>
+            <w:tcBorders>
+              <w:top w:val="single" w:color="E0E0E0" w:sz="4"/>
+              <w:left w:val="single" w:color="E0E0E0" w:sz="4"/>
+              <w:bottom w:val="single" w:color="E0E0E0" w:sz="4"/>
+              <w:right w:val="single" w:color="E0E0E0" w:sz="4"/>
+            </w:tcBorders>
+            <w:shd w:fill="E3F2FD" w:val="clear"/>
+            <w:tcMar>
+              <w:top w:type="dxa" w:w="60"/>
+              <w:left w:type="dxa" w:w="120"/>
+              <w:bottom w:type="dxa" w:w="60"/>
+              <w:right w:type="dxa" w:w="120"/>
+            </w:tcMar>
+          </w:tcPr>
+          <w:p>
+            <w:r>
+              <w:rPr>
+                <w:rFonts w:ascii="Arial" w:cs="Arial" w:eastAsia="Arial" w:hAnsi="Arial"/>
+                <w:b/>
+                <w:bCs/>
+                <w:color w:val="1565C0"/>
+                <w:sz w:val="22"/>
+                <w:szCs w:val="22"/>
+              </w:rPr>
+              <w:t xml:space="preserve">#</w:t>
+            </w:r>
+          </w:p>
+        </w:tc>
+        <w:tc>
+          <w:tcPr>
+            <w:tcBorders>
+              <w:top w:val="single" w:color="E0E0E0" w:sz="4"/>
+              <w:left w:val="single" w:color="E0E0E0" w:sz="4"/>
+              <w:bottom w:val="single" w:color="E0E0E0" w:sz="4"/>
+              <w:right w:val="single" w:color="E0E0E0" w:sz="4"/>
+            </w:tcBorders>
+            <w:shd w:fill="E3F2FD" w:val="clear"/>
+            <w:tcMar>
+              <w:top w:type="dxa" w:w="60"/>
+              <w:left w:type="dxa" w:w="120"/>
+              <w:bottom w:type="dxa" w:w="60"/>
+              <w:right w:type="dxa" w:w="120"/>
+            </w:tcMar>
+          </w:tcPr>
+          <w:p>
+            <w:r>
+              <w:rPr>
+                <w:rFonts w:ascii="Arial" w:cs="Arial" w:eastAsia="Arial" w:hAnsi="Arial"/>
+                <w:b/>
+                <w:bCs/>
+                <w:color w:val="1565C0"/>
+                <w:sz w:val="22"/>
+                <w:szCs w:val="22"/>
+              </w:rPr>
+              <w:t xml:space="preserve">Stulpelis</w:t>
+            </w:r>
+          </w:p>
+        </w:tc>
+        <w:tc>
+          <w:tcPr>
+            <w:tcBorders>
+              <w:top w:val="single" w:color="E0E0E0" w:sz="4"/>
+              <w:left w:val="single" w:color="E0E0E0" w:sz="4"/>
+              <w:bottom w:val="single" w:color="E0E0E0" w:sz="4"/>
+              <w:right w:val="single" w:color="E0E0E0" w:sz="4"/>
+            </w:tcBorders>
+            <w:shd w:fill="E3F2FD" w:val="clear"/>
+            <w:tcMar>
+              <w:top w:type="dxa" w:w="60"/>
+              <w:left w:type="dxa" w:w="120"/>
+              <w:bottom w:type="dxa" w:w="60"/>
+              <w:right w:type="dxa" w:w="120"/>
+            </w:tcMar>
+          </w:tcPr>
+          <w:p>
+            <w:r>
+              <w:rPr>
+                <w:rFonts w:ascii="Arial" w:cs="Arial" w:eastAsia="Arial" w:hAnsi="Arial"/>
+                <w:b/>
+                <w:bCs/>
+                <w:color w:val="1565C0"/>
+                <w:sz w:val="22"/>
+                <w:szCs w:val="22"/>
+              </w:rPr>
+              <w:t xml:space="preserve">Ką rašyti</w:t>
+            </w:r>
+          </w:p>
+        </w:tc>
+      </w:tr>
+      <w:tr>
+        <w:tc>
+          <w:tcPr>
+            <w:tcBorders>
+              <w:top w:val="single" w:color="E0E0E0" w:sz="4"/>
+              <w:left w:val="single" w:color="E0E0E0" w:sz="4"/>
+              <w:bottom w:val="single" w:color="E0E0E0" w:sz="4"/>
+              <w:right w:val="single" w:color="E0E0E0" w:sz="4"/>
+            </w:tcBorders>
+            <w:shd w:fill="FFFFFF" w:val="clear"/>
+            <w:tcMar>
+              <w:top w:type="dxa" w:w="60"/>
+              <w:left w:type="dxa" w:w="120"/>
+              <w:bottom w:type="dxa" w:w="60"/>
+              <w:right w:type="dxa" w:w="120"/>
+            </w:tcMar>
+          </w:tcPr>
+          <w:p>
+            <w:r>
+              <w:rPr>
+                <w:rFonts w:ascii="Arial" w:cs="Arial" w:eastAsia="Arial" w:hAnsi="Arial"/>
+                <w:color w:val="212121"/>
+                <w:sz w:val="22"/>
+                <w:szCs w:val="22"/>
+              </w:rPr>
+              <w:t xml:space="preserve">1</w:t>
+            </w:r>
+          </w:p>
+        </w:tc>
+        <w:tc>
+          <w:tcPr>
+            <w:tcBorders>
+              <w:top w:val="single" w:color="E0E0E0" w:sz="4"/>
+              <w:left w:val="single" w:color="E0E0E0" w:sz="4"/>
+              <w:bottom w:val="single" w:color="E0E0E0" w:sz="4"/>
+              <w:right w:val="single" w:color="E0E0E0" w:sz="4"/>
+            </w:tcBorders>
+            <w:shd w:fill="FFFFFF" w:val="clear"/>
+            <w:tcMar>
+              <w:top w:type="dxa" w:w="60"/>
+              <w:left w:type="dxa" w:w="120"/>
+              <w:bottom w:type="dxa" w:w="60"/>
+              <w:right w:type="dxa" w:w="120"/>
+            </w:tcMar>
+          </w:tcPr>
+          <w:p>
+            <w:r>
+              <w:rPr>
+                <w:rFonts w:ascii="Arial" w:cs="Arial" w:eastAsia="Arial" w:hAnsi="Arial"/>
+                <w:color w:val="212121"/>
+                <w:sz w:val="22"/>
+                <w:szCs w:val="22"/>
+              </w:rPr>
+              <w:t xml:space="preserve">Saugos sritis</w:t>
+            </w:r>
+          </w:p>
+        </w:tc>
+        <w:tc>
+          <w:tcPr>
+            <w:tcBorders>
+              <w:top w:val="single" w:color="E0E0E0" w:sz="4"/>
+              <w:left w:val="single" w:color="E0E0E0" w:sz="4"/>
+              <w:bottom w:val="single" w:color="E0E0E0" w:sz="4"/>
+              <w:right w:val="single" w:color="E0E0E0" w:sz="4"/>
+            </w:tcBorders>
+            <w:shd w:fill="FFFFFF" w:val="clear"/>
+            <w:tcMar>
+              <w:top w:type="dxa" w:w="60"/>
+              <w:left w:type="dxa" w:w="120"/>
+              <w:bottom w:type="dxa" w:w="60"/>
+              <w:right w:type="dxa" w:w="120"/>
+            </w:tcMar>
+          </w:tcPr>
+          <w:p>
+            <w:r>
+              <w:rPr>
+                <w:rFonts w:ascii="Arial" w:cs="Arial" w:eastAsia="Arial" w:hAnsi="Arial"/>
+                <w:color w:val="212121"/>
+                <w:sz w:val="22"/>
+                <w:szCs w:val="22"/>
+              </w:rPr>
+              <w:t xml:space="preserve">Kurios saugos srities problema? (ergonomika / privatumas / internetinės rizikos / aplinkos poveikis)</w:t>
+            </w:r>
+          </w:p>
+        </w:tc>
+      </w:tr>
+      <w:tr>
+        <w:tc>
+          <w:tcPr>
+            <w:tcBorders>
+              <w:top w:val="single" w:color="E0E0E0" w:sz="4"/>
+              <w:left w:val="single" w:color="E0E0E0" w:sz="4"/>
+              <w:bottom w:val="single" w:color="E0E0E0" w:sz="4"/>
+              <w:right w:val="single" w:color="E0E0E0" w:sz="4"/>
+            </w:tcBorders>
+            <w:shd w:fill="FAFAFA" w:val="clear"/>
+            <w:tcMar>
+              <w:top w:type="dxa" w:w="60"/>
+              <w:left w:type="dxa" w:w="120"/>
+              <w:bottom w:type="dxa" w:w="60"/>
+              <w:right w:type="dxa" w:w="120"/>
+            </w:tcMar>
+          </w:tcPr>
+          <w:p>
+            <w:r>
+              <w:rPr>
+                <w:rFonts w:ascii="Arial" w:cs="Arial" w:eastAsia="Arial" w:hAnsi="Arial"/>
+                <w:color w:val="212121"/>
+                <w:sz w:val="22"/>
+                <w:szCs w:val="22"/>
+              </w:rPr>
+              <w:t xml:space="preserve">2</w:t>
+            </w:r>
+          </w:p>
+        </w:tc>
+        <w:tc>
+          <w:tcPr>
+            <w:tcBorders>
+              <w:top w:val="single" w:color="E0E0E0" w:sz="4"/>
+              <w:left w:val="single" w:color="E0E0E0" w:sz="4"/>
+              <w:bottom w:val="single" w:color="E0E0E0" w:sz="4"/>
+              <w:right w:val="single" w:color="E0E0E0" w:sz="4"/>
+            </w:tcBorders>
+            <w:shd w:fill="FAFAFA" w:val="clear"/>
+            <w:tcMar>
+              <w:top w:type="dxa" w:w="60"/>
+              <w:left w:type="dxa" w:w="120"/>
+              <w:bottom w:type="dxa" w:w="60"/>
+              <w:right w:type="dxa" w:w="120"/>
+            </w:tcMar>
+          </w:tcPr>
+          <w:p>
+            <w:r>
+              <w:rPr>
+                <w:rFonts w:ascii="Arial" w:cs="Arial" w:eastAsia="Arial" w:hAnsi="Arial"/>
+                <w:color w:val="212121"/>
+                <w:sz w:val="22"/>
+                <w:szCs w:val="22"/>
+              </w:rPr>
+              <w:t xml:space="preserve">Problema</w:t>
+            </w:r>
+          </w:p>
+        </w:tc>
+        <w:tc>
+          <w:tcPr>
+            <w:tcBorders>
+              <w:top w:val="single" w:color="E0E0E0" w:sz="4"/>
+              <w:left w:val="single" w:color="E0E0E0" w:sz="4"/>
+              <w:bottom w:val="single" w:color="E0E0E0" w:sz="4"/>
+              <w:right w:val="single" w:color="E0E0E0" w:sz="4"/>
+            </w:tcBorders>
+            <w:shd w:fill="FAFAFA" w:val="clear"/>
+            <w:tcMar>
+              <w:top w:type="dxa" w:w="60"/>
+              <w:left w:type="dxa" w:w="120"/>
+              <w:bottom w:type="dxa" w:w="60"/>
+              <w:right w:type="dxa" w:w="120"/>
+            </w:tcMar>
+          </w:tcPr>
+          <w:p>
+            <w:r>
+              <w:rPr>
+                <w:rFonts w:ascii="Arial" w:cs="Arial" w:eastAsia="Arial" w:hAnsi="Arial"/>
+                <w:color w:val="212121"/>
+                <w:sz w:val="22"/>
+                <w:szCs w:val="22"/>
+              </w:rPr>
+              <w:t xml:space="preserve">Kokia konkreti rizika ar klaida aprašyta scenarijuje? (1 sakinys)</w:t>
+            </w:r>
+          </w:p>
+        </w:tc>
+      </w:tr>
+      <w:tr>
+        <w:tc>
+          <w:tcPr>
+            <w:tcBorders>
+              <w:top w:val="single" w:color="E0E0E0" w:sz="4"/>
+              <w:left w:val="single" w:color="E0E0E0" w:sz="4"/>
+              <w:bottom w:val="single" w:color="E0E0E0" w:sz="4"/>
+              <w:right w:val="single" w:color="E0E0E0" w:sz="4"/>
+            </w:tcBorders>
+            <w:shd w:fill="FFFFFF" w:val="clear"/>
+            <w:tcMar>
+              <w:top w:type="dxa" w:w="60"/>
+              <w:left w:type="dxa" w:w="120"/>
+              <w:bottom w:type="dxa" w:w="60"/>
+              <w:right w:type="dxa" w:w="120"/>
+            </w:tcMar>
+          </w:tcPr>
+          <w:p>
+            <w:r>
+              <w:rPr>
+                <w:rFonts w:ascii="Arial" w:cs="Arial" w:eastAsia="Arial" w:hAnsi="Arial"/>
+                <w:color w:val="212121"/>
+                <w:sz w:val="22"/>
+                <w:szCs w:val="22"/>
+              </w:rPr>
+              <w:t xml:space="preserve">3</w:t>
+            </w:r>
+          </w:p>
+        </w:tc>
+        <w:tc>
+          <w:tcPr>
+            <w:tcBorders>
+              <w:top w:val="single" w:color="E0E0E0" w:sz="4"/>
+              <w:left w:val="single" w:color="E0E0E0" w:sz="4"/>
+              <w:bottom w:val="single" w:color="E0E0E0" w:sz="4"/>
+              <w:right w:val="single" w:color="E0E0E0" w:sz="4"/>
+            </w:tcBorders>
+            <w:shd w:fill="FFFFFF" w:val="clear"/>
+            <w:tcMar>
+              <w:top w:type="dxa" w:w="60"/>
+              <w:left w:type="dxa" w:w="120"/>
+              <w:bottom w:type="dxa" w:w="60"/>
+              <w:right w:type="dxa" w:w="120"/>
+            </w:tcMar>
+          </w:tcPr>
+          <w:p>
+            <w:r>
+              <w:rPr>
+                <w:rFonts w:ascii="Arial" w:cs="Arial" w:eastAsia="Arial" w:hAnsi="Arial"/>
+                <w:color w:val="212121"/>
+                <w:sz w:val="22"/>
+                <w:szCs w:val="22"/>
+              </w:rPr>
+              <w:t xml:space="preserve">Taisyklė</w:t>
+            </w:r>
+          </w:p>
+        </w:tc>
+        <w:tc>
+          <w:tcPr>
+            <w:tcBorders>
+              <w:top w:val="single" w:color="E0E0E0" w:sz="4"/>
+              <w:left w:val="single" w:color="E0E0E0" w:sz="4"/>
+              <w:bottom w:val="single" w:color="E0E0E0" w:sz="4"/>
+              <w:right w:val="single" w:color="E0E0E0" w:sz="4"/>
+            </w:tcBorders>
+            <w:shd w:fill="FFFFFF" w:val="clear"/>
+            <w:tcMar>
+              <w:top w:type="dxa" w:w="60"/>
+              <w:left w:type="dxa" w:w="120"/>
+              <w:bottom w:type="dxa" w:w="60"/>
+              <w:right w:type="dxa" w:w="120"/>
+            </w:tcMar>
+          </w:tcPr>
+          <w:p>
+            <w:r>
+              <w:rPr>
+                <w:rFonts w:ascii="Arial" w:cs="Arial" w:eastAsia="Arial" w:hAnsi="Arial"/>
+                <w:color w:val="212121"/>
+                <w:sz w:val="22"/>
+                <w:szCs w:val="22"/>
+              </w:rPr>
+              <w:t xml:space="preserve">Kokį L pamokose išmoktą principą ar taisyklę čia reikia taikyti?</w:t>
+            </w:r>
+          </w:p>
+        </w:tc>
+      </w:tr>
+      <w:tr>
+        <w:tc>
+          <w:tcPr>
+            <w:tcBorders>
+              <w:top w:val="single" w:color="E0E0E0" w:sz="4"/>
+              <w:left w:val="single" w:color="E0E0E0" w:sz="4"/>
+              <w:bottom w:val="single" w:color="E0E0E0" w:sz="4"/>
+              <w:right w:val="single" w:color="E0E0E0" w:sz="4"/>
+            </w:tcBorders>
+            <w:shd w:fill="FAFAFA" w:val="clear"/>
+            <w:tcMar>
+              <w:top w:type="dxa" w:w="60"/>
+              <w:left w:type="dxa" w:w="120"/>
+              <w:bottom w:type="dxa" w:w="60"/>
+              <w:right w:type="dxa" w:w="120"/>
+            </w:tcMar>
+          </w:tcPr>
+          <w:p>
+            <w:r>
+              <w:rPr>
+                <w:rFonts w:ascii="Arial" w:cs="Arial" w:eastAsia="Arial" w:hAnsi="Arial"/>
+                <w:color w:val="212121"/>
+                <w:sz w:val="22"/>
+                <w:szCs w:val="22"/>
+              </w:rPr>
+              <w:t xml:space="preserve">4</w:t>
+            </w:r>
+          </w:p>
+        </w:tc>
+        <w:tc>
+          <w:tcPr>
+            <w:tcBorders>
+              <w:top w:val="single" w:color="E0E0E0" w:sz="4"/>
+              <w:left w:val="single" w:color="E0E0E0" w:sz="4"/>
+              <w:bottom w:val="single" w:color="E0E0E0" w:sz="4"/>
+              <w:right w:val="single" w:color="E0E0E0" w:sz="4"/>
+            </w:tcBorders>
+            <w:shd w:fill="FAFAFA" w:val="clear"/>
+            <w:tcMar>
+              <w:top w:type="dxa" w:w="60"/>
+              <w:left w:type="dxa" w:w="120"/>
+              <w:bottom w:type="dxa" w:w="60"/>
+              <w:right w:type="dxa" w:w="120"/>
+            </w:tcMar>
+          </w:tcPr>
+          <w:p>
+            <w:r>
+              <w:rPr>
+                <w:rFonts w:ascii="Arial" w:cs="Arial" w:eastAsia="Arial" w:hAnsi="Arial"/>
+                <w:color w:val="212121"/>
+                <w:sz w:val="22"/>
+                <w:szCs w:val="22"/>
+              </w:rPr>
+              <w:t xml:space="preserve">Veiksmas</w:t>
+            </w:r>
+          </w:p>
+        </w:tc>
+        <w:tc>
+          <w:tcPr>
+            <w:tcBorders>
+              <w:top w:val="single" w:color="E0E0E0" w:sz="4"/>
+              <w:left w:val="single" w:color="E0E0E0" w:sz="4"/>
+              <w:bottom w:val="single" w:color="E0E0E0" w:sz="4"/>
+              <w:right w:val="single" w:color="E0E0E0" w:sz="4"/>
+            </w:tcBorders>
+            <w:shd w:fill="FAFAFA" w:val="clear"/>
+            <w:tcMar>
+              <w:top w:type="dxa" w:w="60"/>
+              <w:left w:type="dxa" w:w="120"/>
+              <w:bottom w:type="dxa" w:w="60"/>
+              <w:right w:type="dxa" w:w="120"/>
+            </w:tcMar>
+          </w:tcPr>
+          <w:p>
+            <w:r>
+              <w:rPr>
+                <w:rFonts w:ascii="Arial" w:cs="Arial" w:eastAsia="Arial" w:hAnsi="Arial"/>
+                <w:color w:val="212121"/>
+                <w:sz w:val="22"/>
+                <w:szCs w:val="22"/>
+              </w:rPr>
+              <w:t xml:space="preserve">Ką konkrečiai darytumėte šioje situacijoje? (2–3 sakiniai)</w:t>
+            </w:r>
+          </w:p>
+        </w:tc>
+      </w:tr>
+      <w:tr>
+        <w:tc>
+          <w:tcPr>
+            <w:tcBorders>
+              <w:top w:val="single" w:color="E0E0E0" w:sz="4"/>
+              <w:left w:val="single" w:color="E0E0E0" w:sz="4"/>
+              <w:bottom w:val="single" w:color="E0E0E0" w:sz="4"/>
+              <w:right w:val="single" w:color="E0E0E0" w:sz="4"/>
+            </w:tcBorders>
+            <w:shd w:fill="FFFFFF" w:val="clear"/>
+            <w:tcMar>
+              <w:top w:type="dxa" w:w="60"/>
+              <w:left w:type="dxa" w:w="120"/>
+              <w:bottom w:type="dxa" w:w="60"/>
+              <w:right w:type="dxa" w:w="120"/>
+            </w:tcMar>
+          </w:tcPr>
+          <w:p>
+            <w:r>
+              <w:rPr>
+                <w:rFonts w:ascii="Arial" w:cs="Arial" w:eastAsia="Arial" w:hAnsi="Arial"/>
+                <w:color w:val="212121"/>
+                <w:sz w:val="22"/>
+                <w:szCs w:val="22"/>
+              </w:rPr>
+              <w:t xml:space="preserve">5</w:t>
+            </w:r>
+          </w:p>
+        </w:tc>
+        <w:tc>
+          <w:tcPr>
+            <w:tcBorders>
+              <w:top w:val="single" w:color="E0E0E0" w:sz="4"/>
+              <w:left w:val="single" w:color="E0E0E0" w:sz="4"/>
+              <w:bottom w:val="single" w:color="E0E0E0" w:sz="4"/>
+              <w:right w:val="single" w:color="E0E0E0" w:sz="4"/>
+            </w:tcBorders>
+            <w:shd w:fill="FFFFFF" w:val="clear"/>
+            <w:tcMar>
+              <w:top w:type="dxa" w:w="60"/>
+              <w:left w:type="dxa" w:w="120"/>
+              <w:bottom w:type="dxa" w:w="60"/>
+              <w:right w:type="dxa" w:w="120"/>
+            </w:tcMar>
+          </w:tcPr>
+          <w:p>
+            <w:r>
+              <w:rPr>
+                <w:rFonts w:ascii="Arial" w:cs="Arial" w:eastAsia="Arial" w:hAnsi="Arial"/>
+                <w:color w:val="212121"/>
+                <w:sz w:val="22"/>
+                <w:szCs w:val="22"/>
+              </w:rPr>
+              <w:t xml:space="preserve">Pagrindimas</w:t>
+            </w:r>
+          </w:p>
+        </w:tc>
+        <w:tc>
+          <w:tcPr>
+            <w:tcBorders>
+              <w:top w:val="single" w:color="E0E0E0" w:sz="4"/>
+              <w:left w:val="single" w:color="E0E0E0" w:sz="4"/>
+              <w:bottom w:val="single" w:color="E0E0E0" w:sz="4"/>
+              <w:right w:val="single" w:color="E0E0E0" w:sz="4"/>
+            </w:tcBorders>
+            <w:shd w:fill="FFFFFF" w:val="clear"/>
+            <w:tcMar>
+              <w:top w:type="dxa" w:w="60"/>
+              <w:left w:type="dxa" w:w="120"/>
+              <w:bottom w:type="dxa" w:w="60"/>
+              <w:right w:type="dxa" w:w="120"/>
+            </w:tcMar>
+          </w:tcPr>
+          <w:p>
+            <w:r>
+              <w:rPr>
+                <w:rFonts w:ascii="Arial" w:cs="Arial" w:eastAsia="Arial" w:hAnsi="Arial"/>
+                <w:color w:val="212121"/>
+                <w:sz w:val="22"/>
+                <w:szCs w:val="22"/>
+              </w:rPr>
+              <w:t xml:space="preserve">Kodėl jūsų pasirinktas veiksmas yra tinkamas? (1–2 sakiniai)</w:t>
+            </w:r>
+          </w:p>
+        </w:tc>
+      </w:tr>
+    </w:tbl>
+    <w:p>
+      <w:pPr>
+        <w:spacing w:before="80"/>
+      </w:pPr>
+    </w:p>
+    <w:p>
+      <w:pPr>
+        <w:spacing w:after="80"/>
+      </w:pPr>
+      <w:r>
+        <w:rPr>
+          <w:rFonts w:ascii="Arial" w:cs="Arial" w:eastAsia="Arial" w:hAnsi="Arial"/>
+          <w:b/>
+          <w:bCs/>
+          <w:color w:val="212121"/>
+          <w:sz w:val="22"/>
+          <w:szCs w:val="22"/>
+        </w:rPr>
+        <w:t xml:space="preserve">Laikas: 23 minutės. Stipresniems — papildoma užduotis baigus visus 6.</w:t>
+      </w:r>
+    </w:p>
+    <w:p>
+      <w:pPr>
+        <w:spacing w:before="200"/>
+      </w:pPr>
+    </w:p>
+    <w:p>
+      <w:pPr>
+        <w:pageBreakBefore/>
+      </w:pPr>
+    </w:p>
+    <w:tbl>
+      <w:tblPr>
+        <w:tblW w:type="auto" w:w="100"/>
+        <w:tblBorders>
+          <w:top w:val="none" w:sz="0"/>
+          <w:left w:val="none" w:sz="0"/>
+          <w:bottom w:val="none" w:sz="0"/>
+          <w:right w:val="none" w:sz="0"/>
           <w:insideH w:val="single" w:color="auto" w:sz="4"/>
           <w:insideV w:val="single" w:color="auto" w:sz="4"/>
         </w:tblBorders>
@@ -828,6 +1438,12 @@
         <w:tc>
           <w:tcPr>
             <w:tcW w:type="dxa" w:w="200"/>
+            <w:tcBorders>
+              <w:top w:val="none" w:sz="0"/>
+              <w:left w:val="none" w:sz="0"/>
+              <w:bottom w:val="none" w:sz="0"/>
+              <w:right w:val="none" w:sz="0"/>
+            </w:tcBorders>
             <w:shd w:fill="2E7D32" w:val="clear"/>
           </w:tcPr>
           <w:p/>
@@ -835,6 +1451,12 @@
         <w:tc>
           <w:tcPr>
             <w:tcW w:type="dxa" w:w="9400"/>
+            <w:tcBorders>
+              <w:top w:val="none" w:sz="0"/>
+              <w:left w:val="none" w:sz="0"/>
+              <w:bottom w:val="none" w:sz="0"/>
+              <w:right w:val="none" w:sz="0"/>
+            </w:tcBorders>
             <w:shd w:fill="E8F5E9" w:val="clear"/>
           </w:tcPr>
           <w:p>
@@ -847,7 +1469,7 @@
                 <w:sz w:val="24"/>
                 <w:szCs w:val="24"/>
               </w:rPr>
-              <w:t xml:space="preserve">Scenarijų rotacija</w:t>
+              <w:t xml:space="preserve">Darbo blokas</w:t>
             </w:r>
             <w:r>
               <w:rPr>
@@ -856,7 +1478,7 @@
                 <w:sz w:val="20"/>
                 <w:szCs w:val="20"/>
               </w:rPr>
-              <w:t xml:space="preserve"> — ~25 min.</w:t>
+              <w:t xml:space="preserve"> — ~23 min.</w:t>
             </w:r>
           </w:p>
         </w:tc>
@@ -874,13 +1496,35 @@
           <w:sz w:val="22"/>
           <w:szCs w:val="22"/>
         </w:rPr>
-        <w:t xml:space="preserve">Scenarijai rodomi skaidrėse. Po kiekvieno scenarijaus — kelios minutės mąstymui, tada aptarimas su visa klase.</w:t>
-      </w:r>
+        <w:t xml:space="preserve">Mokiniai dirba individualiai. Scenarijai ir lentelė pateikti Google Classroom dokumente.</w:t>
+      </w:r>
+    </w:p>
+    <w:p>
+      <w:pPr>
+        <w:spacing w:before="80"/>
+      </w:pPr>
     </w:p>
     <w:p>
       <w:pPr>
         <w:keepNext/>
         <w:spacing w:after="80"/>
+      </w:pPr>
+      <w:r>
+        <w:rPr>
+          <w:rFonts w:ascii="Arial" w:cs="Arial" w:eastAsia="Arial" w:hAnsi="Arial"/>
+          <w:b/>
+          <w:bCs/>
+          <w:color w:val="212121"/>
+          <w:sz w:val="22"/>
+          <w:szCs w:val="22"/>
+        </w:rPr>
+        <w:t xml:space="preserve">Scenarijai:</w:t>
+      </w:r>
+    </w:p>
+    <w:p>
+      <w:pPr>
+        <w:spacing w:after="80"/>
+        <w:ind w:left="360"/>
       </w:pPr>
       <w:r>
         <w:rPr>
@@ -891,127 +1535,427 @@
           <w:sz w:val="22"/>
           <w:szCs w:val="22"/>
         </w:rPr>
-        <w:t xml:space="preserve">Scenarijai:</w:t>
+        <w:t xml:space="preserve">1. </w:t>
+      </w:r>
+      <w:r>
+        <w:rPr>
+          <w:rFonts w:ascii="Arial" w:cs="Arial" w:eastAsia="Arial" w:hAnsi="Arial"/>
+          <w:color w:val="212121"/>
+          <w:sz w:val="22"/>
+          <w:szCs w:val="22"/>
+        </w:rPr>
+        <w:t xml:space="preserve">[Ergonomika] </w:t>
+      </w:r>
+      <w:r>
+        <w:rPr>
+          <w:rFonts w:ascii="Arial" w:cs="Arial" w:eastAsia="Arial" w:hAnsi="Arial"/>
+          <w:i/>
+          <w:iCs/>
+          <w:color w:val="212121"/>
+          <w:sz w:val="22"/>
+          <w:szCs w:val="22"/>
+        </w:rPr>
+        <w:t xml:space="preserve">Mokinys žaidžia kompiuterinį žaidimą 3 valandas be pertraukos. Sėdi sulinkęs, ekranas per arti, rankos pakelta aukščiau alkūnių. Po žaidimo skauda nugarą ir akis.</w:t>
       </w:r>
     </w:p>
     <w:p>
       <w:pPr>
         <w:spacing w:after="80"/>
         <w:ind w:left="360"/>
-      </w:pPr>
-      <w:r>
-        <w:rPr>
-          <w:rFonts w:ascii="Arial" w:cs="Arial" w:eastAsia="Arial" w:hAnsi="Arial"/>
-          <w:color w:val="212121"/>
-          <w:sz w:val="22"/>
-          <w:szCs w:val="22"/>
-        </w:rPr>
-        <w:t xml:space="preserve">1. [Ergonomika] Mokinys skundžiasi nugaros skausmu po 3 valandų prie kompiuterio. Ką jis daro neteisingai? Ką patarti?</w:t>
-      </w:r>
-    </w:p>
-    <w:p>
-      <w:pPr>
-        <w:spacing w:after="80"/>
-        <w:ind w:left="360"/>
-      </w:pPr>
-      <w:r>
-        <w:rPr>
-          <w:rFonts w:ascii="Arial" w:cs="Arial" w:eastAsia="Arial" w:hAnsi="Arial"/>
-          <w:color w:val="212121"/>
-          <w:sz w:val="22"/>
-          <w:szCs w:val="22"/>
-        </w:rPr>
-        <w:t xml:space="preserve">2. [Privatumas] Nauja svetainė prašo įvesti asmens kodą „amžiaus patvirtinimui“. Ar saugu? Kodėl?</w:t>
-      </w:r>
-    </w:p>
-    <w:p>
-      <w:pPr>
-        <w:spacing w:after="80"/>
-        <w:ind w:left="360"/>
-      </w:pPr>
-      <w:r>
-        <w:rPr>
-          <w:rFonts w:ascii="Arial" w:cs="Arial" w:eastAsia="Arial" w:hAnsi="Arial"/>
-          <w:color w:val="212121"/>
-          <w:sz w:val="22"/>
-          <w:szCs w:val="22"/>
-        </w:rPr>
-        <w:t xml:space="preserve">3. [Phishing] Gauni SMS: „Jūsų siunta užstrįgo. Paspauskite nuorodą patvirtinimui.“ Niekada neužsisakei siuntos. Ką daryti?</w:t>
-      </w:r>
-    </w:p>
-    <w:p>
-      <w:pPr>
-        <w:spacing w:after="80"/>
-        <w:ind w:left="360"/>
-      </w:pPr>
-      <w:r>
-        <w:rPr>
-          <w:rFonts w:ascii="Arial" w:cs="Arial" w:eastAsia="Arial" w:hAnsi="Arial"/>
-          <w:color w:val="212121"/>
-          <w:sz w:val="22"/>
-          <w:szCs w:val="22"/>
-        </w:rPr>
-        <w:t xml:space="preserve">4. [Aplinka] Klasė kiekvieną dieną žiūri YouTube video per pietaus pertrauką. Ar tai turi poveikį aplinkai? Kaip?</w:t>
-      </w:r>
-    </w:p>
-    <w:p>
-      <w:pPr>
-        <w:spacing w:after="80"/>
-        <w:ind w:left="360"/>
-      </w:pPr>
-      <w:r>
-        <w:rPr>
-          <w:rFonts w:ascii="Arial" w:cs="Arial" w:eastAsia="Arial" w:hAnsi="Arial"/>
-          <w:color w:val="212121"/>
-          <w:sz w:val="22"/>
-          <w:szCs w:val="22"/>
-        </w:rPr>
-        <w:t xml:space="preserve">5. [Mišrus] Draugas siūlo parsisiųsti nemokamą žaidimą iš nežinomo šaltinio. Kokie pavojai? Ką daryti?</w:t>
-      </w:r>
-    </w:p>
-    <w:p>
-      <w:pPr>
-        <w:spacing w:after="80"/>
-        <w:ind w:left="360"/>
-      </w:pPr>
-      <w:r>
-        <w:rPr>
-          <w:rFonts w:ascii="Arial" w:cs="Arial" w:eastAsia="Arial" w:hAnsi="Arial"/>
-          <w:color w:val="212121"/>
-          <w:sz w:val="22"/>
-          <w:szCs w:val="22"/>
-        </w:rPr>
-        <w:t xml:space="preserve">6. [Mišrus] Mokinys naudoja tą patį slaptažodį visoms paskyroms ir niekada neatnaujina telefono OS. Kokios rizikos?</w:t>
-      </w:r>
-    </w:p>
-    <w:p>
-      <w:pPr>
-        <w:spacing w:after="80"/>
       </w:pPr>
       <w:r>
         <w:rPr>
           <w:rFonts w:ascii="Arial" w:cs="Arial" w:eastAsia="Arial" w:hAnsi="Arial"/>
           <w:b/>
           <w:bCs/>
-          <w:color w:val="424242"/>
-          <w:sz w:val="22"/>
-          <w:szCs w:val="22"/>
-        </w:rPr>
-        <w:t xml:space="preserve">Stipresniems mokiniams:</w:t>
-      </w:r>
-    </w:p>
-    <w:p>
-      <w:pPr>
-        <w:spacing w:after="80"/>
-      </w:pPr>
-      <w:r>
-        <w:rPr>
-          <w:rFonts w:ascii="Arial" w:cs="Arial" w:eastAsia="Arial" w:hAnsi="Arial"/>
-          <w:color w:val="212121"/>
-          <w:sz w:val="22"/>
-          <w:szCs w:val="22"/>
-        </w:rPr>
-        <w:t xml:space="preserve">Papildomas iššūkis: sugalvoti savo scenarijų, kuris apima bent 2 saugos sritis vienu metu.</w:t>
+          <w:color w:val="2E7D32"/>
+          <w:sz w:val="22"/>
+          <w:szCs w:val="22"/>
+        </w:rPr>
+        <w:t xml:space="preserve">2. </w:t>
+      </w:r>
+      <w:r>
+        <w:rPr>
+          <w:rFonts w:ascii="Arial" w:cs="Arial" w:eastAsia="Arial" w:hAnsi="Arial"/>
+          <w:color w:val="212121"/>
+          <w:sz w:val="22"/>
+          <w:szCs w:val="22"/>
+        </w:rPr>
+        <w:t xml:space="preserve">[Privatumas] </w:t>
+      </w:r>
+      <w:r>
+        <w:rPr>
+          <w:rFonts w:ascii="Arial" w:cs="Arial" w:eastAsia="Arial" w:hAnsi="Arial"/>
+          <w:i/>
+          <w:iCs/>
+          <w:color w:val="212121"/>
+          <w:sz w:val="22"/>
+          <w:szCs w:val="22"/>
+        </w:rPr>
+        <w:t xml:space="preserve">Draugas prašo pasidalinti „Netflix" paskyros slaptažodžiu. Mokinys naudoja tą patį slaptažodį ir el. paštui, ir socialiniams tinklams.</w:t>
+      </w:r>
+    </w:p>
+    <w:p>
+      <w:pPr>
+        <w:spacing w:after="80"/>
+        <w:ind w:left="360"/>
+      </w:pPr>
+      <w:r>
+        <w:rPr>
+          <w:rFonts w:ascii="Arial" w:cs="Arial" w:eastAsia="Arial" w:hAnsi="Arial"/>
+          <w:b/>
+          <w:bCs/>
+          <w:color w:val="2E7D32"/>
+          <w:sz w:val="22"/>
+          <w:szCs w:val="22"/>
+        </w:rPr>
+        <w:t xml:space="preserve">3. </w:t>
+      </w:r>
+      <w:r>
+        <w:rPr>
+          <w:rFonts w:ascii="Arial" w:cs="Arial" w:eastAsia="Arial" w:hAnsi="Arial"/>
+          <w:color w:val="212121"/>
+          <w:sz w:val="22"/>
+          <w:szCs w:val="22"/>
+        </w:rPr>
+        <w:t xml:space="preserve">[Internetinės rizikos] </w:t>
+      </w:r>
+      <w:r>
+        <w:rPr>
+          <w:rFonts w:ascii="Arial" w:cs="Arial" w:eastAsia="Arial" w:hAnsi="Arial"/>
+          <w:i/>
+          <w:iCs/>
+          <w:color w:val="212121"/>
+          <w:sz w:val="22"/>
+          <w:szCs w:val="22"/>
+        </w:rPr>
+        <w:t xml:space="preserve">Ateina el. laiškas nuo „bank@lltuvos-bankas.com" su prašymu skubiai patvirtinti tapatybę per nuorodą, kitaip paskyra bus užblokuota.</w:t>
+      </w:r>
+    </w:p>
+    <w:p>
+      <w:pPr>
+        <w:spacing w:after="80"/>
+        <w:ind w:left="360"/>
+      </w:pPr>
+      <w:r>
+        <w:rPr>
+          <w:rFonts w:ascii="Arial" w:cs="Arial" w:eastAsia="Arial" w:hAnsi="Arial"/>
+          <w:b/>
+          <w:bCs/>
+          <w:color w:val="2E7D32"/>
+          <w:sz w:val="22"/>
+          <w:szCs w:val="22"/>
+        </w:rPr>
+        <w:t xml:space="preserve">4. </w:t>
+      </w:r>
+      <w:r>
+        <w:rPr>
+          <w:rFonts w:ascii="Arial" w:cs="Arial" w:eastAsia="Arial" w:hAnsi="Arial"/>
+          <w:color w:val="212121"/>
+          <w:sz w:val="22"/>
+          <w:szCs w:val="22"/>
+        </w:rPr>
+        <w:t xml:space="preserve">[Aplinkos poveikis] </w:t>
+      </w:r>
+      <w:r>
+        <w:rPr>
+          <w:rFonts w:ascii="Arial" w:cs="Arial" w:eastAsia="Arial" w:hAnsi="Arial"/>
+          <w:i/>
+          <w:iCs/>
+          <w:color w:val="212121"/>
+          <w:sz w:val="22"/>
+          <w:szCs w:val="22"/>
+        </w:rPr>
+        <w:t xml:space="preserve">Klasiokas sako: „Aš kasdien žiūriu 4 val. TikTok, bet tai tik telefonas — jokio poveikio aplinkai." Ar jis teisus?</w:t>
+      </w:r>
+    </w:p>
+    <w:p>
+      <w:pPr>
+        <w:spacing w:after="80"/>
+        <w:ind w:left="360"/>
+      </w:pPr>
+      <w:r>
+        <w:rPr>
+          <w:rFonts w:ascii="Arial" w:cs="Arial" w:eastAsia="Arial" w:hAnsi="Arial"/>
+          <w:b/>
+          <w:bCs/>
+          <w:color w:val="2E7D32"/>
+          <w:sz w:val="22"/>
+          <w:szCs w:val="22"/>
+        </w:rPr>
+        <w:t xml:space="preserve">5. </w:t>
+      </w:r>
+      <w:r>
+        <w:rPr>
+          <w:rFonts w:ascii="Arial" w:cs="Arial" w:eastAsia="Arial" w:hAnsi="Arial"/>
+          <w:color w:val="212121"/>
+          <w:sz w:val="22"/>
+          <w:szCs w:val="22"/>
+        </w:rPr>
+        <w:t xml:space="preserve">[Privatumas + 2FA] </w:t>
+      </w:r>
+      <w:r>
+        <w:rPr>
+          <w:rFonts w:ascii="Arial" w:cs="Arial" w:eastAsia="Arial" w:hAnsi="Arial"/>
+          <w:i/>
+          <w:iCs/>
+          <w:color w:val="212121"/>
+          <w:sz w:val="22"/>
+          <w:szCs w:val="22"/>
+        </w:rPr>
+        <w:t xml:space="preserve">Mokinio Instagram paskyra nulaužta. Paaiškėja, kad slaptažodis buvo „Futbolas123" ir dviejų veiksnių autentifikacija nebuvo įjungta. Ką daryti dabar ir ką reikėjo daryti anksčiau?</w:t>
+      </w:r>
+    </w:p>
+    <w:p>
+      <w:pPr>
+        <w:spacing w:after="80"/>
+        <w:ind w:left="360"/>
+      </w:pPr>
+      <w:r>
+        <w:rPr>
+          <w:rFonts w:ascii="Arial" w:cs="Arial" w:eastAsia="Arial" w:hAnsi="Arial"/>
+          <w:b/>
+          <w:bCs/>
+          <w:color w:val="2E7D32"/>
+          <w:sz w:val="22"/>
+          <w:szCs w:val="22"/>
+        </w:rPr>
+        <w:t xml:space="preserve">6. </w:t>
+      </w:r>
+      <w:r>
+        <w:rPr>
+          <w:rFonts w:ascii="Arial" w:cs="Arial" w:eastAsia="Arial" w:hAnsi="Arial"/>
+          <w:color w:val="212121"/>
+          <w:sz w:val="22"/>
+          <w:szCs w:val="22"/>
+        </w:rPr>
+        <w:t xml:space="preserve">[Socialinė inžinerija] </w:t>
+      </w:r>
+      <w:r>
+        <w:rPr>
+          <w:rFonts w:ascii="Arial" w:cs="Arial" w:eastAsia="Arial" w:hAnsi="Arial"/>
+          <w:i/>
+          <w:iCs/>
+          <w:color w:val="212121"/>
+          <w:sz w:val="22"/>
+          <w:szCs w:val="22"/>
+        </w:rPr>
+        <w:t xml:space="preserve">Per „Discord" nepažįstamas asmuo, prisistato mokyklos IT administratoriumi ir prašo atsiųsti prisijungimo duomenis „sistemos atnaujinimui."</w:t>
+      </w:r>
+    </w:p>
+    <w:p>
+      <w:pPr>
+        <w:spacing w:before="80"/>
+      </w:pPr>
+    </w:p>
+    <w:p>
+      <w:pPr>
+        <w:spacing w:after="80"/>
+      </w:pPr>
+      <w:r>
+        <w:rPr>
+          <w:rFonts w:ascii="Arial" w:cs="Arial" w:eastAsia="Arial" w:hAnsi="Arial"/>
+          <w:b/>
+          <w:bCs/>
+          <w:color w:val="212121"/>
+          <w:sz w:val="22"/>
+          <w:szCs w:val="22"/>
+        </w:rPr>
+        <w:t xml:space="preserve">Mokytojo veiksmai:</w:t>
+      </w:r>
+    </w:p>
+    <w:p>
+      <w:pPr>
+        <w:spacing w:after="80"/>
+      </w:pPr>
+      <w:r>
+        <w:rPr>
+          <w:rFonts w:ascii="Arial" w:cs="Arial" w:eastAsia="Arial" w:hAnsi="Arial"/>
+          <w:color w:val="212121"/>
+          <w:sz w:val="22"/>
+          <w:szCs w:val="22"/>
+        </w:rPr>
+        <w:t xml:space="preserve">Vaikščiokite po klasę. Nekonsultuokite bendrai — dirbkite individualiai.</w:t>
+      </w:r>
+    </w:p>
+    <w:p>
+      <w:pPr>
+        <w:spacing w:before="40"/>
+      </w:pPr>
+    </w:p>
+    <w:p>
+      <w:pPr>
+        <w:spacing w:after="80"/>
+      </w:pPr>
+      <w:r>
+        <w:rPr>
+          <w:rFonts w:ascii="Arial" w:cs="Arial" w:eastAsia="Arial" w:hAnsi="Arial"/>
+          <w:b/>
+          <w:bCs/>
+          <w:color w:val="212121"/>
+          <w:sz w:val="22"/>
+          <w:szCs w:val="22"/>
+        </w:rPr>
+        <w:t xml:space="preserve">Tiksliniai klausimai, jei mokinys stringa:</w:t>
+      </w:r>
+    </w:p>
+    <w:p>
+      <w:pPr>
+        <w:spacing w:after="80"/>
+        <w:ind w:left="360"/>
+      </w:pPr>
+      <w:r>
+        <w:rPr>
+          <w:rFonts w:ascii="Arial" w:cs="Arial" w:eastAsia="Arial" w:hAnsi="Arial"/>
+          <w:color w:val="212121"/>
+          <w:sz w:val="22"/>
+          <w:szCs w:val="22"/>
+        </w:rPr>
+        <w:t xml:space="preserve">• „Kokios srities tai problema — fizinė, skaitmeninė ar aplinkos?"</w:t>
+      </w:r>
+    </w:p>
+    <w:p>
+      <w:pPr>
+        <w:spacing w:after="80"/>
+        <w:ind w:left="360"/>
+      </w:pPr>
+      <w:r>
+        <w:rPr>
+          <w:rFonts w:ascii="Arial" w:cs="Arial" w:eastAsia="Arial" w:hAnsi="Arial"/>
+          <w:color w:val="212121"/>
+          <w:sz w:val="22"/>
+          <w:szCs w:val="22"/>
+        </w:rPr>
+        <w:t xml:space="preserve">• „Kokią taisyklę ar principą mokėmės L pamokoje apie šią sritį?"</w:t>
+      </w:r>
+    </w:p>
+    <w:p>
+      <w:pPr>
+        <w:spacing w:after="80"/>
+        <w:ind w:left="360"/>
+      </w:pPr>
+      <w:r>
+        <w:rPr>
+          <w:rFonts w:ascii="Arial" w:cs="Arial" w:eastAsia="Arial" w:hAnsi="Arial"/>
+          <w:color w:val="212121"/>
+          <w:sz w:val="22"/>
+          <w:szCs w:val="22"/>
+        </w:rPr>
+        <w:t xml:space="preserve">• „Kas nutiktų, jei nieko nedarytum?"</w:t>
+      </w:r>
+    </w:p>
+    <w:p>
+      <w:pPr>
+        <w:spacing w:before="80"/>
+      </w:pPr>
+    </w:p>
+    <w:p>
+      <w:pPr>
+        <w:keepLines/>
+        <w:shd w:fill="FFF8E1" w:val="clear"/>
+        <w:spacing w:after="80" w:before="80"/>
+        <w:ind w:left="240"/>
+      </w:pPr>
+      <w:r>
+        <w:rPr>
+          <w:rFonts w:ascii="Arial" w:cs="Arial" w:eastAsia="Arial" w:hAnsi="Arial"/>
+          <w:b/>
+          <w:bCs/>
+          <w:color w:val="E65100"/>
+          <w:sz w:val="22"/>
+          <w:szCs w:val="22"/>
+        </w:rPr>
+        <w:t xml:space="preserve">⚠ Dažna klaida: </w:t>
+      </w:r>
+      <w:r>
+        <w:rPr>
+          <w:rFonts w:ascii="Arial" w:cs="Arial" w:eastAsia="Arial" w:hAnsi="Arial"/>
+          <w:color w:val="212121"/>
+          <w:sz w:val="22"/>
+          <w:szCs w:val="22"/>
+        </w:rPr>
+        <w:t xml:space="preserve">mokinys rašo „reikia būti atsargiam" — per bendras atsakymas. </w:t>
+      </w:r>
+      <w:r>
+        <w:rPr>
+          <w:rFonts w:ascii="Arial" w:cs="Arial" w:eastAsia="Arial" w:hAnsi="Arial"/>
+          <w:b/>
+          <w:bCs/>
+          <w:color w:val="212121"/>
+          <w:sz w:val="22"/>
+          <w:szCs w:val="22"/>
+        </w:rPr>
+        <w:t xml:space="preserve">Taisyklė: reikalauti konkrečių veiksmų, pvz., „pakeisti slaptažodį", „taikyti 20-20-20", „patikrinti domeno pavadinimą".</w:t>
+      </w:r>
+    </w:p>
+    <w:p>
+      <w:pPr>
+        <w:spacing w:before="80"/>
+      </w:pPr>
+    </w:p>
+    <w:p>
+      <w:pPr>
+        <w:spacing w:after="80"/>
+      </w:pPr>
+      <w:r>
+        <w:rPr>
+          <w:rFonts w:ascii="Arial" w:cs="Arial" w:eastAsia="Arial" w:hAnsi="Arial"/>
+          <w:b/>
+          <w:bCs/>
+          <w:color w:val="212121"/>
+          <w:sz w:val="22"/>
+          <w:szCs w:val="22"/>
+        </w:rPr>
+        <w:t xml:space="preserve">Silpnesniems mokiniams:</w:t>
+      </w:r>
+    </w:p>
+    <w:p>
+      <w:pPr>
+        <w:spacing w:after="80"/>
+      </w:pPr>
+      <w:r>
+        <w:rPr>
+          <w:rFonts w:ascii="Arial" w:cs="Arial" w:eastAsia="Arial" w:hAnsi="Arial"/>
+          <w:color w:val="212121"/>
+          <w:sz w:val="22"/>
+          <w:szCs w:val="22"/>
+        </w:rPr>
+        <w:t xml:space="preserve">Pasiūlykite pradėti nuo 1-o arba 4-o scenarijaus (aiškiausios situacijos). Jei mokinys neįsitraukia per 3 min. — nurodykite konkretų pirmą žingsnį: „Pirmiausia nuspręsk — kokios srities tai problema."</w:t>
+      </w:r>
+    </w:p>
+    <w:p>
+      <w:pPr>
+        <w:spacing w:before="80"/>
+      </w:pPr>
+    </w:p>
+    <w:p>
+      <w:pPr>
+        <w:spacing w:after="80"/>
+      </w:pPr>
+      <w:r>
+        <w:rPr>
+          <w:rFonts w:ascii="Arial" w:cs="Arial" w:eastAsia="Arial" w:hAnsi="Arial"/>
+          <w:b/>
+          <w:bCs/>
+          <w:color w:val="212121"/>
+          <w:sz w:val="22"/>
+          <w:szCs w:val="22"/>
+        </w:rPr>
+        <w:t xml:space="preserve">Stipresniems mokiniams (kai baigia 6 scenarijus):</w:t>
+      </w:r>
+    </w:p>
+    <w:p>
+      <w:pPr>
+        <w:spacing w:after="80"/>
+      </w:pPr>
+      <w:r>
+        <w:rPr>
+          <w:rFonts w:ascii="Arial" w:cs="Arial" w:eastAsia="Arial" w:hAnsi="Arial"/>
+          <w:color w:val="212121"/>
+          <w:sz w:val="22"/>
+          <w:szCs w:val="22"/>
+        </w:rPr>
+        <w:t xml:space="preserve">7-as scenarijus: „Sugalvokite savo scenarijų, kuriame susikerta bent dvi skirtingos saugos sritys (pvz., ergonomika + aplinkos poveikis). Parašykite scenarijų ir idealų atsakymą pagal tą pačią lentelės struktūrą."</w:t>
       </w:r>
     </w:p>
     <w:p>
@@ -1023,10 +1967,10 @@
       <w:tblPr>
         <w:tblW w:type="auto" w:w="100"/>
         <w:tblBorders>
-          <w:top w:val="none" w:color="FFFFFF" w:sz="0"/>
-          <w:left w:val="none" w:color="FFFFFF" w:sz="0"/>
-          <w:bottom w:val="none" w:color="FFFFFF" w:sz="0"/>
-          <w:right w:val="none" w:color="FFFFFF" w:sz="0"/>
+          <w:top w:val="none" w:sz="0"/>
+          <w:left w:val="none" w:sz="0"/>
+          <w:bottom w:val="none" w:sz="0"/>
+          <w:right w:val="none" w:sz="0"/>
           <w:insideH w:val="single" w:color="auto" w:sz="4"/>
           <w:insideV w:val="single" w:color="auto" w:sz="4"/>
         </w:tblBorders>
@@ -1043,6 +1987,12 @@
         <w:tc>
           <w:tcPr>
             <w:tcW w:type="dxa" w:w="200"/>
+            <w:tcBorders>
+              <w:top w:val="none" w:sz="0"/>
+              <w:left w:val="none" w:sz="0"/>
+              <w:bottom w:val="none" w:sz="0"/>
+              <w:right w:val="none" w:sz="0"/>
+            </w:tcBorders>
             <w:shd w:fill="F57C00" w:val="clear"/>
           </w:tcPr>
           <w:p/>
@@ -1050,6 +2000,12 @@
         <w:tc>
           <w:tcPr>
             <w:tcW w:type="dxa" w:w="9400"/>
+            <w:tcBorders>
+              <w:top w:val="none" w:sz="0"/>
+              <w:left w:val="none" w:sz="0"/>
+              <w:bottom w:val="none" w:sz="0"/>
+              <w:right w:val="none" w:sz="0"/>
+            </w:tcBorders>
             <w:shd w:fill="FFF3E0" w:val="clear"/>
           </w:tcPr>
           <w:p>
@@ -1071,7 +2027,7 @@
                 <w:sz w:val="20"/>
                 <w:szCs w:val="20"/>
               </w:rPr>
-              <w:t xml:space="preserve"> — ~3 min.</w:t>
+              <w:t xml:space="preserve"> — ~4 min.</w:t>
             </w:r>
           </w:p>
         </w:tc>
@@ -1079,7 +2035,6 @@
     </w:tbl>
     <w:p>
       <w:pPr>
-        <w:keepNext/>
         <w:spacing w:after="80"/>
       </w:pPr>
       <w:r>
@@ -1100,12 +2055,28 @@
           <w:sz w:val="22"/>
           <w:szCs w:val="22"/>
         </w:rPr>
-        <w:t xml:space="preserve">žodinis. Klausimai skaidrėje.</w:t>
-      </w:r>
-    </w:p>
-    <w:p>
-      <w:pPr>
-        <w:keepNext/>
+        <w:t xml:space="preserve">žodinis.</w:t>
+      </w:r>
+    </w:p>
+    <w:p>
+      <w:pPr>
+        <w:spacing w:after="80"/>
+        <w:ind w:left="240"/>
+      </w:pPr>
+      <w:r>
+        <w:rPr>
+          <w:rFonts w:ascii="Arial" w:cs="Arial" w:eastAsia="Arial" w:hAnsi="Arial"/>
+          <w:i/>
+          <w:iCs/>
+          <w:color w:val="616161"/>
+          <w:sz w:val="20"/>
+          <w:szCs w:val="20"/>
+        </w:rPr>
+        <w:t xml:space="preserve">(Refleksija apie taikymo procesą, ne faktų prisiminimas.)</w:t>
+      </w:r>
+    </w:p>
+    <w:p>
+      <w:pPr>
         <w:spacing w:after="60"/>
         <w:ind w:left="360"/>
       </w:pPr>
@@ -1127,12 +2098,11 @@
           <w:sz w:val="22"/>
           <w:szCs w:val="22"/>
         </w:rPr>
-        <w:t xml:space="preserve">Kurią saugos sritį dažniausiai pažeidžia jūsų bendraamžiai? Kodėl taip manote?</w:t>
-      </w:r>
-    </w:p>
-    <w:p>
-      <w:pPr>
-        <w:keepNext/>
+        <w:t xml:space="preserve">Kurią saugos sritį buvo lengviausia atpažinti scenarijuose ir kodėl?</w:t>
+      </w:r>
+    </w:p>
+    <w:p>
+      <w:pPr>
         <w:spacing w:after="60"/>
         <w:ind w:left="360"/>
       </w:pPr>
@@ -1154,7 +2124,33 @@
           <w:sz w:val="22"/>
           <w:szCs w:val="22"/>
         </w:rPr>
-        <w:t xml:space="preserve">Pateikite vieną pavyzdį, kaip vienas veiksmas gali paliešti ir skaitmeninę saugą, ir aplinką.</w:t>
+        <w:t xml:space="preserve">Kuriame scenarijuje tavo sprendimas buvo mažiausiai tikras — kas sukėlė abejonių?</w:t>
+      </w:r>
+    </w:p>
+    <w:p>
+      <w:pPr>
+        <w:spacing w:after="60"/>
+        <w:ind w:left="360"/>
+      </w:pPr>
+      <w:r>
+        <w:rPr>
+          <w:rFonts w:ascii="Arial" w:cs="Arial" w:eastAsia="Arial" w:hAnsi="Arial"/>
+          <w:b/>
+          <w:bCs/>
+          <w:color w:val="F57C00"/>
+          <w:sz w:val="22"/>
+          <w:szCs w:val="22"/>
+        </w:rPr>
+        <w:t xml:space="preserve">3. </w:t>
+      </w:r>
+      <w:r>
+        <w:rPr>
+          <w:rFonts w:ascii="Arial" w:cs="Arial" w:eastAsia="Arial" w:hAnsi="Arial"/>
+          <w:color w:val="212121"/>
+          <w:sz w:val="22"/>
+          <w:szCs w:val="22"/>
+        </w:rPr>
+        <w:t xml:space="preserve">Ką šiandien supratai kitaip nei per L pamokas, kai teko pačiam taikyti taisykles?</w:t>
       </w:r>
     </w:p>
     <w:p>
@@ -1200,7 +2196,7 @@
           <w:sz w:val="21"/>
           <w:szCs w:val="21"/>
         </w:rPr>
-        <w:t xml:space="preserve">Integravimo pamokoje mokiniai pritaikė visų keturių saugos temų žinias (ergonomika, privatumas, internetinės rizikos, aplinkos poveikis) analizuodami naujus scenarijus. Kiekvienoje situacijoje identifikavo problemą, prisiminė atitinkamą taisyklę ir pasiūlė konkretų veiksmą.</w:t>
+        <w:t xml:space="preserve">Integravimo pamokoje mokiniai individualiai analizavo šešis saugaus elgesio scenarijus, apimančius visas keturias saugos sritis: ergonomiką, privatumą ir paskyrų saugą, internetines rizikas bei skaitmeninių technologijų poveikį aplinkai. Kiekvienam scenarijui mokiniai raštu identifikavo saugos sritį, įvardijo problemą, nurodė taikytiną taisyklę iš L pamokų, pasiūlė konkretų veiksmą ir pagrindė savo sprendimą. Stipresni mokiniai kūrė savo scenarijų su dviejų sričių sankirtumu.</w:t>
       </w:r>
     </w:p>
     <w:sectPr>

</xml_diff>

<commit_message>
Safety module QA report fixing session.
</commit_message>
<xml_diff>
--- a/Grade_9/Semester_1/01_Safety/005_I - Scenario rotation task/Teacher_Plan.docx
+++ b/Grade_9/Semester_1/01_Safety/005_I - Scenario rotation task/Teacher_Plan.docx
@@ -1301,7 +1301,7 @@
           <w:sz w:val="22"/>
           <w:szCs w:val="22"/>
         </w:rPr>
-        <w:t xml:space="preserve">Socialiniame tinkle nepažįstamas asmuo siūlo pildyti apklausą „nušiotojo telefono laimikis“. Apklausa prašo vardo, mokyklos pavadinimo ir el. pašto.</w:t>
+        <w:t xml:space="preserve">Socialiniame tinkle nepažįstamas asmuo siūlo pildyti apklausą „mobiliojo telefono laikiklis“. Apklausa prašo vardo, mokyklos pavadinimo ir el. pašto.</w:t>
       </w:r>
     </w:p>
     <w:p>
@@ -1338,7 +1338,7 @@
           <w:sz w:val="22"/>
           <w:szCs w:val="22"/>
         </w:rPr>
-        <w:t xml:space="preserve">Mokinys keičia senus nešiojamąjį ir telefoną į naujus kasmet. Seni įrenginiai tiesiog išmetami į šiukšliadėžę. Prie kompiuterio darbo vieta nereguliuojama.</w:t>
+        <w:t xml:space="preserve">Mokinys keičia nešiojamąjį kompiuterį ir telefoną į naujus kasmet. Seni įrenginiai tiesiog išmetami į šiukšliadėžę. Prie kompiuterio darbo vieta nereguliuojama.</w:t>
       </w:r>
     </w:p>
     <w:p>

</xml_diff>